<commit_message>
REDCap: 25% per sessie met derde ontlastingstest; Usual Care e24 alleen op maand 6, baseline geblindeerd in e09; documenten en kengetallen bijgewerkt
Co-Authored-By: Claude Opus 5.5 <noreply@anthropic.com>
</commit_message>
<xml_diff>
--- a/REDCap/PARADISE_REDCap_acceptatietest.docx
+++ b/REDCap/PARADISE_REDCap_acceptatietest.docx
@@ -200,7 +200,7 @@
                 <w:color w:val="1B2630"/>
                 <w:sz w:val="15"/>
               </w:rPr>
-              <w:t>41 formulieren, 1487 velden</w:t>
+              <w:t>41 formulieren, 1494 velden</w:t>
             </w:r>
           </w:p>
         </w:tc>
@@ -255,7 +255,7 @@
                 <w:color w:val="1B2630"/>
                 <w:sz w:val="15"/>
               </w:rPr>
-              <w:t>206 aangevinkte combinaties over 31 events en twee armen</w:t>
+              <w:t>199 aangevinkte combinaties over 31 events en twee armen</w:t>
             </w:r>
           </w:p>
         </w:tc>
@@ -770,7 +770,7 @@
                 <w:color w:val="1B2630"/>
                 <w:sz w:val="15"/>
               </w:rPr>
-              <w:t>Vijftien formulieren, waaronder demographics, e07, e08, e09, e14, e15, e21 en e45. Géén e18.</w:t>
+              <w:t>Veertien formulieren, waaronder demographics, e07, e08, e09, e14, e15, e21 en e45. Géén e18. In e09 staat bovenaan de melding dat de baselinemeting in Usual Care geblindeerd is.</w:t>
             </w:r>
           </w:p>
         </w:tc>
@@ -880,7 +880,7 @@
                 <w:color w:val="1B2630"/>
                 <w:sz w:val="15"/>
               </w:rPr>
-              <w:t>e24_drukmeting_uc verschijnt, NIET e24_drukherverdeling_oc. Ook geen e28, e29 of e32.</w:t>
+              <w:t>Geen e24: in Usual Care wordt op visite 2 niet gemeten. Ook geen e24_drukherverdeling_oc, e28, e29 of e32.</w:t>
             </w:r>
           </w:p>
         </w:tc>
@@ -892,6 +892,62 @@
             <w:pPr>
               <w:spacing w:before="30" w:after="30" w:line="252" w:lineRule="auto"/>
             </w:pPr>
+            <w:r/>
+          </w:p>
+        </w:tc>
+      </w:tr>
+      <w:tr>
+        <w:tc>
+          <w:tcPr>
+            <w:tcW w:type="dxa" w:w="1814"/>
+          </w:tcPr>
+          <w:p>
+            <w:pPr>
+              <w:spacing w:before="30" w:after="30" w:line="252" w:lineRule="auto"/>
+            </w:pPr>
+            <w:r/>
+            <w:r>
+              <w:rPr>
+                <w:rFonts w:ascii="Segoe UI" w:hAnsi="Segoe UI" w:eastAsia="Segoe UI"/>
+                <w:b w:val="0"/>
+                <w:i w:val="0"/>
+                <w:color w:val="1B2630"/>
+                <w:sz w:val="15"/>
+              </w:rPr>
+              <w:t>Visite 4</w:t>
+            </w:r>
+          </w:p>
+        </w:tc>
+        <w:tc>
+          <w:tcPr>
+            <w:tcW w:type="dxa" w:w="7257"/>
+          </w:tcPr>
+          <w:p>
+            <w:pPr>
+              <w:spacing w:before="30" w:after="30" w:line="252" w:lineRule="auto"/>
+            </w:pPr>
+            <w:r/>
+            <w:r>
+              <w:rPr>
+                <w:rFonts w:ascii="Segoe UI" w:hAnsi="Segoe UI" w:eastAsia="Segoe UI"/>
+                <w:b w:val="0"/>
+                <w:i w:val="0"/>
+                <w:color w:val="1B2630"/>
+                <w:sz w:val="15"/>
+              </w:rPr>
+              <w:t>e24_drukmeting_uc verschijnt; bij Meetmoment staat alleen "Maand 6". Op visite 6 en 8 staat er geen e24.</w:t>
+            </w:r>
+          </w:p>
+        </w:tc>
+        <w:tc>
+          <w:tcPr>
+            <w:tcW w:type="dxa" w:w="794"/>
+          </w:tcPr>
+          <w:p>
+            <w:pPr>
+              <w:spacing w:before="30" w:after="30" w:line="252" w:lineRule="auto"/>
+            </w:pPr>
+            <w:r/>
             <w:r/>
           </w:p>
         </w:tc>
@@ -1230,7 +1286,7 @@
                 <w:color w:val="1B2630"/>
                 <w:sz w:val="15"/>
               </w:rPr>
-              <w:t>e18_logboek_educatie verschijnt, met acht visiteblokken in één formulier.</w:t>
+              <w:t>e18_logboek_educatie verschijnt, met acht visiteblokken in één formulier. In e09 staat géén blinderingsmelding.</w:t>
             </w:r>
           </w:p>
         </w:tc>
@@ -1285,7 +1341,7 @@
                 <w:color w:val="1B2630"/>
                 <w:sz w:val="15"/>
               </w:rPr>
-              <w:t>e24_drukherverdeling_oc, e28_activiteitenprofiel en e29_teach_back verschijnen. NIET e24_drukmeting_uc.</w:t>
+              <w:t>e24_drukherverdeling_oc, e28_activiteitenprofiel en e29_teach_back verschijnen. NIET e24_drukmeting_uc. Per doelregio drie extra ontlastingstesten.</w:t>
             </w:r>
           </w:p>
         </w:tc>
@@ -1845,6 +1901,83 @@
             <w:pPr>
               <w:spacing w:before="30" w:after="30" w:line="252" w:lineRule="auto"/>
             </w:pPr>
+            <w:r/>
+          </w:p>
+        </w:tc>
+      </w:tr>
+      <w:tr>
+        <w:tc>
+          <w:tcPr>
+            <w:tcW w:type="dxa" w:w="2268"/>
+          </w:tcPr>
+          <w:p>
+            <w:pPr>
+              <w:spacing w:before="30" w:after="30" w:line="252" w:lineRule="auto"/>
+            </w:pPr>
+            <w:r/>
+            <w:r>
+              <w:rPr>
+                <w:rFonts w:ascii="Segoe UI" w:hAnsi="Segoe UI" w:eastAsia="Segoe UI"/>
+                <w:b w:val="0"/>
+                <w:i w:val="0"/>
+                <w:color w:val="1B2630"/>
+                <w:sz w:val="15"/>
+              </w:rPr>
+              <w:t>e24oc_d1_reductie, op visite 4</w:t>
+            </w:r>
+          </w:p>
+        </w:tc>
+        <w:tc>
+          <w:tcPr>
+            <w:tcW w:type="dxa" w:w="2608"/>
+          </w:tcPr>
+          <w:p>
+            <w:pPr>
+              <w:spacing w:before="30" w:after="30" w:line="252" w:lineRule="auto"/>
+            </w:pPr>
+            <w:r/>
+            <w:r>
+              <w:rPr>
+                <w:rFonts w:ascii="Segoe UI" w:hAnsi="Segoe UI" w:eastAsia="Segoe UI"/>
+                <w:b w:val="0"/>
+                <w:i w:val="0"/>
+                <w:color w:val="1B2630"/>
+                <w:sz w:val="15"/>
+              </w:rPr>
+              <w:t>zonder 280, met 200 (op visite 2 was zonder 300)</w:t>
+            </w:r>
+          </w:p>
+        </w:tc>
+        <w:tc>
+          <w:tcPr>
+            <w:tcW w:type="dxa" w:w="4195"/>
+          </w:tcPr>
+          <w:p>
+            <w:pPr>
+              <w:spacing w:before="30" w:after="30" w:line="252" w:lineRule="auto"/>
+            </w:pPr>
+            <w:r/>
+            <w:r>
+              <w:rPr>
+                <w:rFonts w:ascii="Segoe UI" w:hAnsi="Segoe UI" w:eastAsia="Segoe UI"/>
+                <w:b w:val="0"/>
+                <w:i w:val="0"/>
+                <w:color w:val="1B2630"/>
+                <w:sz w:val="15"/>
+              </w:rPr>
+              <w:t>reductie 28,6 en norm 1: gerekend tegenover zonder van dezelfde sessie, niet tegenover visite 2 (dat gaf 33,3)</w:t>
+            </w:r>
+          </w:p>
+        </w:tc>
+        <w:tc>
+          <w:tcPr>
+            <w:tcW w:type="dxa" w:w="794"/>
+          </w:tcPr>
+          <w:p>
+            <w:pPr>
+              <w:spacing w:before="30" w:after="30" w:line="252" w:lineRule="auto"/>
+            </w:pPr>
+            <w:r/>
             <w:r/>
           </w:p>
         </w:tc>

</xml_diff>

<commit_message>
eCRF 49 Registratie consultatieduur: start- en einduur van podoloog en verpleegkundige op visite 1 tot 8, beide armen
Papieren formulier in Per nummer, Per protocolnaam en Per visite V1-V8; REDCap-instrument
e49_consultatieduur (13 velden, duur berekend in minuten) op 16 events; overzicht, opzet,
acceptatietest en BRONNEN bijgewerkt. Kommaversie dictionary: rij e10_basis had een
ongequote komma (19 kolommen), hersteld.

Co-Authored-By: Claude Opus 5.5 <noreply@anthropic.com>
</commit_message>
<xml_diff>
--- a/REDCap/PARADISE_REDCap_acceptatietest.docx
+++ b/REDCap/PARADISE_REDCap_acceptatietest.docx
@@ -200,7 +200,7 @@
                 <w:color w:val="1B2630"/>
                 <w:sz w:val="15"/>
               </w:rPr>
-              <w:t>41 formulieren, 1494 velden</w:t>
+              <w:t>42 formulieren, 1507 velden</w:t>
             </w:r>
           </w:p>
         </w:tc>
@@ -255,7 +255,7 @@
                 <w:color w:val="1B2630"/>
                 <w:sz w:val="15"/>
               </w:rPr>
-              <w:t>199 aangevinkte combinaties over 31 events en twee armen</w:t>
+              <w:t>215 aangevinkte combinaties over 31 events en twee armen</w:t>
             </w:r>
           </w:p>
         </w:tc>
@@ -770,7 +770,7 @@
                 <w:color w:val="1B2630"/>
                 <w:sz w:val="15"/>
               </w:rPr>
-              <w:t>Veertien formulieren, waaronder demographics, e07, e08, e09, e14, e15, e21 en e45. Géén e18. In e09 staat bovenaan de melding dat de baselinemeting in Usual Care geblindeerd is.</w:t>
+              <w:t>Vijftien formulieren, waaronder demographics, e07, e08, e09, e14, e15, e21, e45 en e49. Géén e18. In e09 staat bovenaan de melding dat de baselinemeting in Usual Care geblindeerd is.</w:t>
             </w:r>
           </w:p>
         </w:tc>
@@ -1102,6 +1102,62 @@
                 <w:sz w:val="15"/>
               </w:rPr>
               <w:t>concomitant_therapy laat per visite meerdere regels toevoegen.</w:t>
+            </w:r>
+          </w:p>
+        </w:tc>
+        <w:tc>
+          <w:tcPr>
+            <w:tcW w:type="dxa" w:w="794"/>
+          </w:tcPr>
+          <w:p>
+            <w:pPr>
+              <w:spacing w:before="30" w:after="30" w:line="252" w:lineRule="auto"/>
+            </w:pPr>
+            <w:r/>
+          </w:p>
+        </w:tc>
+      </w:tr>
+      <w:tr>
+        <w:tc>
+          <w:tcPr>
+            <w:tcW w:type="dxa" w:w="1814"/>
+          </w:tcPr>
+          <w:p>
+            <w:pPr>
+              <w:spacing w:before="30" w:after="30" w:line="252" w:lineRule="auto"/>
+            </w:pPr>
+            <w:r/>
+            <w:r>
+              <w:rPr>
+                <w:rFonts w:ascii="Segoe UI" w:hAnsi="Segoe UI" w:eastAsia="Segoe UI"/>
+                <w:b w:val="0"/>
+                <w:i w:val="0"/>
+                <w:color w:val="1B2630"/>
+                <w:sz w:val="15"/>
+              </w:rPr>
+              <w:t>Visite 1 tot 8</w:t>
+            </w:r>
+          </w:p>
+        </w:tc>
+        <w:tc>
+          <w:tcPr>
+            <w:tcW w:type="dxa" w:w="7257"/>
+          </w:tcPr>
+          <w:p>
+            <w:pPr>
+              <w:spacing w:before="30" w:after="30" w:line="252" w:lineRule="auto"/>
+            </w:pPr>
+            <w:r>
+              <w:t>e49_consultatieduur verschijnt op elk van de acht bezoeken, in beide armen. Zet "Heeft een podoloog de deelnemer op deze visite gezien?" op Nee: initialen, start- en einduur verdwijnen.</w:t>
+            </w:r>
+            <w:r>
+              <w:rPr>
+                <w:rFonts w:ascii="Segoe UI" w:hAnsi="Segoe UI" w:eastAsia="Segoe UI"/>
+                <w:b w:val="0"/>
+                <w:i w:val="0"/>
+                <w:color w:val="1B2630"/>
+                <w:sz w:val="15"/>
+              </w:rPr>
             </w:r>
           </w:p>
         </w:tc>
@@ -2438,6 +2494,85 @@
           </w:p>
         </w:tc>
       </w:tr>
+      <w:tr>
+        <w:tc>
+          <w:tcPr>
+            <w:tcW w:type="dxa" w:w="2268"/>
+          </w:tcPr>
+          <w:p>
+            <w:pPr>
+              <w:spacing w:before="30" w:after="30" w:line="252" w:lineRule="auto"/>
+            </w:pPr>
+            <w:r>
+              <w:t>e49_pod_duur</w:t>
+            </w:r>
+            <w:r>
+              <w:rPr>
+                <w:rFonts w:ascii="Segoe UI" w:hAnsi="Segoe UI" w:eastAsia="Segoe UI"/>
+                <w:b w:val="0"/>
+                <w:i w:val="0"/>
+                <w:color w:val="1B2630"/>
+                <w:sz w:val="15"/>
+              </w:rPr>
+            </w:r>
+          </w:p>
+        </w:tc>
+        <w:tc>
+          <w:tcPr>
+            <w:tcW w:type="dxa" w:w="2608"/>
+          </w:tcPr>
+          <w:p>
+            <w:pPr>
+              <w:spacing w:before="30" w:after="30" w:line="252" w:lineRule="auto"/>
+            </w:pPr>
+            <w:r>
+              <w:t>startuur 09:10, einduur 10:25</w:t>
+            </w:r>
+            <w:r>
+              <w:rPr>
+                <w:rFonts w:ascii="Segoe UI" w:hAnsi="Segoe UI" w:eastAsia="Segoe UI"/>
+                <w:b w:val="0"/>
+                <w:i w:val="0"/>
+                <w:color w:val="1B2630"/>
+                <w:sz w:val="15"/>
+              </w:rPr>
+            </w:r>
+          </w:p>
+        </w:tc>
+        <w:tc>
+          <w:tcPr>
+            <w:tcW w:type="dxa" w:w="4195"/>
+          </w:tcPr>
+          <w:p>
+            <w:pPr>
+              <w:spacing w:before="30" w:after="30" w:line="252" w:lineRule="auto"/>
+            </w:pPr>
+            <w:r>
+              <w:t>75. Einduur 09:00 geeft −10: een negatieve duur wijst op een invoerfout</w:t>
+            </w:r>
+            <w:r>
+              <w:rPr>
+                <w:rFonts w:ascii="Segoe UI" w:hAnsi="Segoe UI" w:eastAsia="Segoe UI"/>
+                <w:b w:val="0"/>
+                <w:i w:val="0"/>
+                <w:color w:val="1B2630"/>
+                <w:sz w:val="15"/>
+              </w:rPr>
+            </w:r>
+          </w:p>
+        </w:tc>
+        <w:tc>
+          <w:tcPr>
+            <w:tcW w:type="dxa" w:w="794"/>
+          </w:tcPr>
+          <w:p>
+            <w:pPr>
+              <w:spacing w:before="30" w:after="30" w:line="252" w:lineRule="auto"/>
+            </w:pPr>
+            <w:r/>
+          </w:p>
+        </w:tc>
+      </w:tr>
     </w:tbl>
     <w:p>
       <w:pPr>

</xml_diff>